<commit_message>
Round-2 critic edits: rewrite Task 1b paradigm and Task 1a questions with waves 6-8 data; update summary, worklog, docx
Co-Authored-By: Claude Fable 5.1 <noreply@anthropic.com>
Claude-Session: https://claude.ai/code/session_01EE4HMb7PtAw48MeVTv7HV8
</commit_message>
<xml_diff>
--- a/docs/deliverables_docx/SUMMARY_RU.docx
+++ b/docs/deliverables_docx/SUMMARY_RU.docx
@@ -7,7 +7,100 @@
         <w:pStyle w:val="Heading1"/>
       </w:pPr>
       <w:r>
-        <w:t>Сводка для утра: что за задача, что сделано, что получилось (≈2 страницы)</w:t>
+        <w:t>Утренний брифинг (5 минут на чтение, 2 часа на сдачу)</w:t>
+      </w:r>
+    </w:p>
+    <w:p>
+      <w:r/>
+      <w:r>
+        <w:rPr>
+          <w:b/>
+        </w:rPr>
+        <w:t>Где:</w:t>
+      </w:r>
+      <w:r>
+        <w:t xml:space="preserve"> </w:t>
+      </w:r>
+      <w:r>
+        <w:rPr>
+          <w:rFonts w:ascii="Courier New" w:hAnsi="Courier New"/>
+        </w:rPr>
+        <w:t>/home/user/MATS_warmup</w:t>
+      </w:r>
+      <w:r>
+        <w:t xml:space="preserve">, ветка </w:t>
+      </w:r>
+      <w:r>
+        <w:rPr>
+          <w:rFonts w:ascii="Courier New" w:hAnsi="Courier New"/>
+        </w:rPr>
+        <w:t>claude/wonderful-wozniak-t5n9yb</w:t>
+      </w:r>
+      <w:r>
+        <w:t xml:space="preserve">, запушено в </w:t>
+      </w:r>
+      <w:r>
+        <w:rPr>
+          <w:rFonts w:ascii="Courier New" w:hAnsi="Courier New"/>
+        </w:rPr>
+        <w:t>github.com/MortiferumUrsus/MATS_warmup</w:t>
+      </w:r>
+      <w:r>
+        <w:t xml:space="preserve">. </w:t>
+      </w:r>
+      <w:r>
+        <w:rPr>
+          <w:b/>
+        </w:rPr>
+        <w:t>Что сдаём (моя рекомендация):</w:t>
+      </w:r>
+      <w:r>
+        <w:t xml:space="preserve"> Task 1b + Task 2 (две критики + supplementary); Task 1a — опционально, приложением. </w:t>
+      </w:r>
+      <w:r>
+        <w:rPr>
+          <w:b/>
+        </w:rPr>
+        <w:t>Что осталось:</w:t>
+      </w:r>
+      <w:r>
+        <w:t xml:space="preserve"> прогнать 4 промпта в бесплатных ChatGPT/Gemini (~40 мин), вычитать (~35 мин), собрать Google Doc (~40 мин). </w:t>
+      </w:r>
+      <w:r>
+        <w:rPr>
+          <w:b/>
+        </w:rPr>
+        <w:t>Оценки независимых критиков</w:t>
+      </w:r>
+      <w:r>
+        <w:t xml:space="preserve"> (агенты со свежим контекстом, два раунда): критика 1 — 6 → 7.5/10; критика 2 — 7 → 7/10; Task 1b — 6 → 6/10 (после правок ожидаемо выше); Task 1a — 5 → 6/10. Все замечания обоих раундов отработаны (</w:t>
+      </w:r>
+      <w:r>
+        <w:rPr>
+          <w:rFonts w:ascii="Courier New" w:hAnsi="Courier New"/>
+        </w:rPr>
+        <w:t>experiments/critic_reviews.md</w:t>
+      </w:r>
+      <w:r>
+        <w:t xml:space="preserve">). </w:t>
+      </w:r>
+      <w:r>
+        <w:rPr>
+          <w:b/>
+        </w:rPr>
+        <w:t>Риск:</w:t>
+      </w:r>
+      <w:r>
+        <w:t xml:space="preserve"> ссылки в </w:t>
+      </w:r>
+      <w:r>
+        <w:rPr>
+          <w:rFonts w:ascii="Courier New" w:hAnsi="Courier New"/>
+        </w:rPr>
+        <w:t>research/README.md</w:t>
+      </w:r>
+      <w:r>
+        <w:t xml:space="preserve"> из среды не открывались — проверьте перед цитированием.</w:t>
       </w:r>
     </w:p>
     <w:p>
@@ -15,12 +108,12 @@
         <w:pStyle w:val="Heading2"/>
       </w:pPr>
       <w:r>
-        <w:t>1. Контекст: что вообще происходит</w:t>
+        <w:t>1. Контекст (что за задача)</w:t>
       </w:r>
     </w:p>
     <w:p>
       <w:r>
-        <w:t xml:space="preserve">Это work test для MATS у менторов </w:t>
+        <w:t xml:space="preserve">Work test для MATS у менторов </w:t>
       </w:r>
       <w:r>
         <w:rPr>
@@ -29,7 +122,7 @@
         <w:t>Caspar Oesterheld и Emery Cooper</w:t>
       </w:r>
       <w:r>
-        <w:t xml:space="preserve"> (Redwood Research, команда «conceptual reasoning capabilities»). Их программа: измерять и улучшать способность LLM к «концептуальным» рассуждениям — задачам без проверяемого ответа, где прогресс возможен только через аргументы (теория принятия решений, акаузальная кооперация, стратегия AI safety). У них три датасета: </w:t>
+        <w:t xml:space="preserve"> (Redwood Research). Они измеряют и улучшают «концептуальные» рассуждения LLM — задачи без проверяемого ответа (теория принятия решений, акаузальная кооперация, стратегия AI safety). Для сдачи важен один их датасет — </w:t>
       </w:r>
       <w:r>
         <w:rPr>
@@ -38,25 +131,7 @@
         <w:t>DTBench</w:t>
       </w:r>
       <w:r>
-        <w:t xml:space="preserve"> (407 вопросов по Newcomb-подобным задачам; «насыщен» к июню 2026), </w:t>
-      </w:r>
-      <w:r>
-        <w:rPr>
-          <w:b/>
-        </w:rPr>
-        <w:t>LMCA</w:t>
-      </w:r>
-      <w:r>
-        <w:t xml:space="preserve"> (экспертные оценки критик аргументов) и </w:t>
-      </w:r>
-      <w:r>
-        <w:rPr>
-          <w:b/>
-        </w:rPr>
-        <w:t>ACCoRD</w:t>
-      </w:r>
-      <w:r>
-        <w:t xml:space="preserve"> (согласованность вероятностных суждений); вместе — Conceptual Reasoning Index (Anthropic + Redwood, август 2026). Заметки и ссылки — </w:t>
+        <w:t xml:space="preserve">: 407 вопросов по Newcomb-подобным задачам, к июню 2026 фронтир-модели решают его почти полностью. Остальное — в </w:t>
       </w:r>
       <w:r>
         <w:rPr>
@@ -65,12 +140,12 @@
         <w:t>research/README.md</w:t>
       </w:r>
       <w:r>
-        <w:t>.</w:t>
+        <w:t>, утром не нужно.</w:t>
       </w:r>
     </w:p>
     <w:p>
       <w:r>
-        <w:t>Тест из двух частей (менторы прямо пишут: «слабо в одной половине, очень сильно в другой» — приемлемо):</w:t>
+        <w:t>Тест из двух частей (менторы прямо пишут: слабо в одной половине и очень сильно в другой — приемлемо):</w:t>
       </w:r>
     </w:p>
     <w:p>
@@ -85,7 +160,7 @@
         <w:t>Task 1</w:t>
       </w:r>
       <w:r>
-        <w:t xml:space="preserve"> — на выбор: </w:t>
+        <w:t xml:space="preserve">, на выбор: </w:t>
       </w:r>
       <w:r>
         <w:rPr>
@@ -94,7 +169,7 @@
         <w:t>1a</w:t>
       </w:r>
       <w:r>
-        <w:t xml:space="preserve"> три вопроса в стиле DTBench, на которых ошибаются фронтир-модели; </w:t>
+        <w:t xml:space="preserve"> — три вопроса в стиле DTBench, на которых ошибаются фронтир-модели; </w:t>
       </w:r>
       <w:r>
         <w:rPr>
@@ -103,7 +178,7 @@
         <w:t>1b</w:t>
       </w:r>
       <w:r>
-        <w:t xml:space="preserve"> </w:t>
+        <w:t xml:space="preserve"> — </w:t>
       </w:r>
       <w:r>
         <w:rPr>
@@ -111,13 +186,11 @@
         </w:rPr>
         <w:t>парадигма</w:t>
       </w:r>
-      <w:r>
-        <w:t xml:space="preserve"> (повторяемая</w:t>
-      </w:r>
+      <w:r/>
     </w:p>
     <w:p>
       <w:r>
-        <w:t>методика) построения трудных концептуальных вопросов + ≥3 примера с рубрикой и обоснованием.</w:t>
+        <w:t>(повторяемая методика) построения трудных концептуальных вопросов + ≥3 примера с рубрикой и обоснованием.</w:t>
       </w:r>
     </w:p>
     <w:p>
@@ -132,80 +205,12 @@
         <w:t>Task 2</w:t>
       </w:r>
       <w:r>
-        <w:t xml:space="preserve"> — критика двух аргументов (по одной проблеме на аргумент, ≤1.5 стр. каждая): «Haste consideration» (80000 Hours,</w:t>
+        <w:t xml:space="preserve"> — критика двух аргументов, по одной проблеме на каждый, ≤1.5 страницы: «Haste consideration» (80000 Hours, 2012) и</w:t>
       </w:r>
     </w:p>
     <w:p>
       <w:r>
-        <w:t>2012) и explainer «Blind Anthropic Cooperation» (BAC — идея самого Остерхельда).</w:t>
-      </w:r>
-    </w:p>
-    <w:p>
-      <w:r>
-        <w:t xml:space="preserve">Сдача — Google Doc. Все материалы в репозитории (ветка </w:t>
-      </w:r>
-      <w:r>
-        <w:rPr>
-          <w:rFonts w:ascii="Courier New" w:hAnsi="Courier New"/>
-        </w:rPr>
-        <w:t>claude/wonderful-wozniak-t5n9yb</w:t>
-      </w:r>
-      <w:r>
-        <w:t xml:space="preserve">), на английском, готовы к переносу: </w:t>
-      </w:r>
-      <w:r>
-        <w:rPr>
-          <w:rFonts w:ascii="Courier New" w:hAnsi="Courier New"/>
-        </w:rPr>
-        <w:t>task2/critique1_haste.md</w:t>
-      </w:r>
-      <w:r>
-        <w:t xml:space="preserve">, </w:t>
-      </w:r>
-      <w:r>
-        <w:rPr>
-          <w:rFonts w:ascii="Courier New" w:hAnsi="Courier New"/>
-        </w:rPr>
-        <w:t>task2/critique2_bac.md</w:t>
-      </w:r>
-      <w:r>
-        <w:t xml:space="preserve">, </w:t>
-      </w:r>
-      <w:r>
-        <w:rPr>
-          <w:rFonts w:ascii="Courier New" w:hAnsi="Courier New"/>
-        </w:rPr>
-        <w:t>task2/notes_supplementary.md</w:t>
-      </w:r>
-      <w:r>
-        <w:t xml:space="preserve">, </w:t>
-      </w:r>
-      <w:r>
-        <w:rPr>
-          <w:rFonts w:ascii="Courier New" w:hAnsi="Courier New"/>
-        </w:rPr>
-        <w:t>task1b/paradigm.md</w:t>
-      </w:r>
-      <w:r>
-        <w:t xml:space="preserve">, </w:t>
-      </w:r>
-      <w:r>
-        <w:rPr>
-          <w:rFonts w:ascii="Courier New" w:hAnsi="Courier New"/>
-        </w:rPr>
-        <w:t>task1a/questions.md</w:t>
-      </w:r>
-      <w:r>
-        <w:t xml:space="preserve">. Навигация — </w:t>
-      </w:r>
-      <w:r>
-        <w:rPr>
-          <w:rFonts w:ascii="Courier New" w:hAnsi="Courier New"/>
-        </w:rPr>
-        <w:t>README.md</w:t>
-      </w:r>
-      <w:r>
-        <w:t>.</w:t>
+        <w:t>explainer «Blind Anthropic Cooperation» (BAC — идея самого Остерхельда: агенты видят только своих «детей»-симуляции, не видят «родителя», и награждают детей в надежде, что родитель наградит их).</w:t>
       </w:r>
     </w:p>
     <w:p>
@@ -218,25 +223,334 @@
     </w:p>
     <w:p>
       <w:r>
-        <w:t xml:space="preserve">Сеть была почти закрыта (только поиск и GitHub) — ресерч по поисковым сводкам и памяти. Главный инструмент — </w:t>
+        <w:t xml:space="preserve">Сеть была почти закрыта, поэтому ресерч — по поисковым сводкам и памяти. Главный инструмент — эксперименты на «чистых» агентах: каждый вопрос давался отдельному агенту без контекста. Модели: Claude Haiku 4.5, Sonnet 5, Opus 5, Fable 5.1. </w:t>
       </w:r>
       <w:r>
         <w:rPr>
           <w:b/>
         </w:rPr>
-        <w:t>эксперименты на «чистых» агентах</w:t>
+        <w:t>Fable — сильнейшая из доступных</w:t>
       </w:r>
       <w:r>
-        <w:t xml:space="preserve">: каждый вопрос давался отдельному агенту без контекста (Claude Haiku/Sonnet/Opus/Fable), всего ≈190 прогонов в шесть волн. Каждый результат затем прошёл через </w:t>
+        <w:t xml:space="preserve">, поэтому фраза «не роняет Fable» ниже и есть главная оговорка по Task 1a. Всего ≈260 прогонов (8 волн); таблицы — </w:t>
+      </w:r>
+      <w:r>
+        <w:rPr>
+          <w:rFonts w:ascii="Courier New" w:hAnsi="Courier New"/>
+        </w:rPr>
+        <w:t>experiments/batch1…batch7</w:t>
+      </w:r>
+      <w:r>
+        <w:t xml:space="preserve">, стенограммы провалов — </w:t>
+      </w:r>
+      <w:r>
+        <w:rPr>
+          <w:rFonts w:ascii="Courier New" w:hAnsi="Courier New"/>
+        </w:rPr>
+        <w:t>experiments/transcripts_key_failures.md</w:t>
+      </w:r>
+      <w:r>
+        <w:t xml:space="preserve">. Каждый черновик прошёл через независимых критиков; версии до правок — </w:t>
+      </w:r>
+      <w:r>
+        <w:rPr>
+          <w:rFonts w:ascii="Courier New" w:hAnsi="Courier New"/>
+        </w:rPr>
+        <w:t>*_v1_before_review.md</w:t>
+      </w:r>
+      <w:r>
+        <w:t xml:space="preserve">. Метод «отжига» из Telegram — </w:t>
+      </w:r>
+      <w:r>
+        <w:rPr>
+          <w:rFonts w:ascii="Courier New" w:hAnsi="Courier New"/>
+        </w:rPr>
+        <w:t>docs/stuck_method.md</w:t>
+      </w:r>
+      <w:r>
+        <w:t xml:space="preserve">. </w:t>
       </w:r>
       <w:r>
         <w:rPr>
           <w:b/>
         </w:rPr>
-        <w:t>независимых агентов-критиков</w:t>
+        <w:t>GPT/Gemini протестировать было нельзя</w:t>
       </w:r>
       <w:r>
-        <w:t xml:space="preserve"> (два раунда): их отчёты — в </w:t>
+        <w:t xml:space="preserve"> — это пункт 1 плана ниже.</w:t>
+      </w:r>
+    </w:p>
+    <w:p>
+      <w:pPr>
+        <w:pStyle w:val="Heading2"/>
+      </w:pPr>
+      <w:r>
+        <w:t>3. Что получилось</w:t>
+      </w:r>
+    </w:p>
+    <w:p>
+      <w:r/>
+      <w:r>
+        <w:rPr>
+          <w:b/>
+        </w:rPr>
+        <w:t>Task 2 — самая сильная часть.</w:t>
+      </w:r>
+      <w:r/>
+    </w:p>
+    <w:p>
+      <w:pPr>
+        <w:pStyle w:val="ListBullet"/>
+      </w:pPr>
+      <w:r/>
+      <w:r>
+        <w:rPr>
+          <w:i/>
+        </w:rPr>
+        <w:t>Аргумент 1 (спешка).</w:t>
+      </w:r>
+      <w:r>
+        <w:t xml:space="preserve"> Одна проблема: мысленный эксперимент сравнивает не «время сейчас» с «временем потом», а два вида</w:t>
+      </w:r>
+    </w:p>
+    <w:p>
+      <w:r>
+        <w:t>деятельности — «завербовать эквивалент целой жизни за 2 года» и «прямую работу». Всю работу делает оговорка «не хуже тебя». Она симметрична во времени: той же конструкцией «доказывается», что годы 30–32 ценнее всего, что после них. Но доказывается только «целое ≥ части», а не тезис автора, что единица ресурса сейчас ценнее той же единицы потом. Лучший ответ защитника (раньше завербовал — дольше работает рекрут) признан и ограничен: линейный эффект, ~в 2 раза за 20 лет, и всего ~10% там, где применяется совет про годы учёбы; текст на него не опирается. Что могут оспорить: что уступка защитнику слишком щедрая.</w:t>
+      </w:r>
+    </w:p>
+    <w:p>
+      <w:pPr>
+        <w:pStyle w:val="ListBullet"/>
+      </w:pPr>
+      <w:r/>
+      <w:r>
+        <w:rPr>
+          <w:i/>
+        </w:rPr>
+        <w:t>Аргумент 2 (BAC).</w:t>
+      </w:r>
+      <w:r>
+        <w:t xml:space="preserve"> Одна проблема: утверждение «BAC изоморфен многопользовательскому Stag Hunt (3p против 1)» ложно при</w:t>
+      </w:r>
+    </w:p>
+    <w:p>
+      <w:r>
+        <w:t xml:space="preserve">собственных выплатах explainer'а. Цена BAC </w:t>
+      </w:r>
+      <w:r>
+        <w:rPr>
+          <w:i/>
+        </w:rPr>
+        <w:t>условна</w:t>
+      </w:r>
+      <w:r>
+        <w:t xml:space="preserve">: платишь только BAC-детям. Значит выплата за BAC = 3p + (1−p) = </w:t>
+      </w:r>
+      <w:r>
+        <w:rPr>
+          <w:b/>
+        </w:rPr>
+        <w:t>1 + 2p</w:t>
+      </w:r>
+      <w:r>
+        <w:t xml:space="preserve">, а за Take = </w:t>
+      </w:r>
+      <w:r>
+        <w:rPr>
+          <w:b/>
+        </w:rPr>
+        <w:t>1</w:t>
+      </w:r>
+      <w:r>
+        <w:t>: BAC слабо доминирует при любом p, риска нет, порога 1/3 нет. Разобран лучший ответ защитника: если все дети — «листья», BAC на этом уровне совпадает с отвергнутой наивной политикой, и порог возвращается ровно там, где условность пуста. Вывод: рушится не рациональность BAC, а объяснение «почему и когда». Что могут оспорить: «исправление только усиливает BAC» — ответ на это есть в тексте (модель без риска не объясняет, чем BAC труден).</w:t>
+      </w:r>
+    </w:p>
+    <w:p>
+      <w:r/>
+      <w:r>
+        <w:rPr>
+          <w:b/>
+        </w:rPr>
+        <w:t>Task 1b — вторая по силе, главная находка ночи.</w:t>
+      </w:r>
+      <w:r>
+        <w:t xml:space="preserve"> Парадигма </w:t>
+      </w:r>
+      <w:r>
+        <w:rPr>
+          <w:b/>
+        </w:rPr>
+        <w:t>«Embedded False Frames»</w:t>
+      </w:r>
+      <w:r>
+        <w:t xml:space="preserve">: берём правдоподобную, нехрестоматийную ложную редукцию (как BAC→Stag Hunt); при прямом вопросе «есть ли проблема?» модели её находят; но если ту же редукцию утвердить в условии и попросить </w:t>
+      </w:r>
+      <w:r>
+        <w:rPr>
+          <w:i/>
+        </w:rPr>
+        <w:t>посчитать</w:t>
+      </w:r>
+      <w:r>
+        <w:t xml:space="preserve"> (долю, ставку дисконтирования) с общей «лазейкой» («если посылка ложна — так и ответьте»), модели считают внутри ложной рамки. Данные: «сеть поставщиков ≅ Stag Hunt» — верных ответов Sonnet 0/4, Opus 1/4, Fable 3/4 (без лазейки — 0/14 у четырёх моделей); «спешка ⇒ ставка r≈0.35» — в финальной формулировке Sonnet/Opus считают 0/3, Fable отвергает 3/3, напрямую все отвергают аргумент; на хрестоматийных ошибках рамку отвергают все. </w:t>
+      </w:r>
+      <w:r>
+        <w:rPr>
+          <w:b/>
+        </w:rPr>
+        <w:t>Абляции:</w:t>
+      </w:r>
+      <w:r>
+        <w:t xml:space="preserve"> явная инструкция «проверь посылки», «в анализе может быть ошибка», лазейка с формулой или оценочный формат A/B/C включают проверку у Opus/Fable, но не у Sonnet; валидный двойник все считают верно. </w:t>
+      </w:r>
+      <w:r>
+        <w:rPr>
+          <w:b/>
+        </w:rPr>
+        <w:t>Тезис:</w:t>
+      </w:r>
+      <w:r>
+        <w:t xml:space="preserve"> модели владеют выводом, но по умолчанию его не запускают. Ценность для менторов: измеряется непрошеная проверка посылок (нужна от модели-соавтора, а не оценщика) и появляется новый тип consistency-constraint'а — вердикт не должен зависеть от способа подачи. Что могут оспорить: «это эффект промпта» — абляции честно показаны, тезис заужен до «проверка по умолчанию».</w:t>
+      </w:r>
+    </w:p>
+    <w:p>
+      <w:r/>
+      <w:r>
+        <w:rPr>
+          <w:b/>
+        </w:rPr>
+        <w:t>Task 1a — слабее, всё честно написано в файле.</w:t>
+      </w:r>
+      <w:r>
+        <w:t xml:space="preserve"> Под честной формулировкой ни один пункт не роняет Fable. D1 (CDT при 50% «я — симуляция», верно one-box) проваливает Haiku, Sonnet — только со «слоганом» в дистракторе; D2 (встроенная рамка) проваливают Haiku, Sonnet, Opus, Fable — без лазейки; D3 (эффект отбора «родитель — случайный агент») проваливают Haiku и Sonnet. Контроль («анропический Fauxcomb») решают все. В файле прямо задействован пункт задания о снисхождении к бесплатным моделям.</w:t>
+      </w:r>
+    </w:p>
+    <w:p>
+      <w:pPr>
+        <w:pStyle w:val="Heading2"/>
+      </w:pPr>
+      <w:r>
+        <w:t>4. План на утро (≈2 часа)</w:t>
+      </w:r>
+    </w:p>
+    <w:p>
+      <w:r/>
+      <w:r>
+        <w:rPr>
+          <w:b/>
+        </w:rPr>
+        <w:t>0. (5 мин) Решение.</w:t>
+      </w:r>
+      <w:r>
+        <w:t xml:space="preserve"> Сдаём 1b как основное, 1a — приложением (правила допускают выбор одного). Всё дальше — под это. </w:t>
+      </w:r>
+      <w:r>
+        <w:rPr>
+          <w:b/>
+        </w:rPr>
+        <w:t>1. (40 мин) Прогоны в бесплатных ChatGPT и Gemini.</w:t>
+      </w:r>
+      <w:r>
+        <w:t xml:space="preserve"> Промпты: </w:t>
+      </w:r>
+      <w:r>
+        <w:rPr>
+          <w:rFonts w:ascii="Courier New" w:hAnsi="Courier New"/>
+        </w:rPr>
+        <w:t>task1a/questions.md</w:t>
+      </w:r>
+      <w:r>
+        <w:t xml:space="preserve"> → блоки </w:t>
+      </w:r>
+      <w:r>
+        <w:rPr>
+          <w:rFonts w:ascii="Courier New" w:hAnsi="Courier New"/>
+        </w:rPr>
+        <w:t>## D1</w:t>
+      </w:r>
+      <w:r>
+        <w:t xml:space="preserve">, </w:t>
+      </w:r>
+      <w:r>
+        <w:rPr>
+          <w:rFonts w:ascii="Courier New" w:hAnsi="Courier New"/>
+        </w:rPr>
+        <w:t>## D2</w:t>
+      </w:r>
+      <w:r>
+        <w:t xml:space="preserve">, </w:t>
+      </w:r>
+      <w:r>
+        <w:rPr>
+          <w:rFonts w:ascii="Courier New" w:hAnsi="Courier New"/>
+        </w:rPr>
+        <w:t>## D3</w:t>
+      </w:r>
+      <w:r>
+        <w:t xml:space="preserve">; </w:t>
+      </w:r>
+      <w:r>
+        <w:rPr>
+          <w:rFonts w:ascii="Courier New" w:hAnsi="Courier New"/>
+        </w:rPr>
+        <w:t>task1b/paradigm.md</w:t>
+      </w:r>
+      <w:r>
+        <w:t xml:space="preserve"> → </w:t>
+      </w:r>
+      <w:r>
+        <w:rPr>
+          <w:rFonts w:ascii="Courier New" w:hAnsi="Courier New"/>
+        </w:rPr>
+        <w:t>### Example 2</w:t>
+      </w:r>
+      <w:r>
+        <w:t xml:space="preserve"> (assertion-форма). Копировать блок «Question» целиком, без рубрики. Ответ вписать в таблицы Evidence в тех же файлах. </w:t>
+      </w:r>
+      <w:r>
+        <w:rPr>
+          <w:b/>
+        </w:rPr>
+        <w:t>План Б:</w:t>
+      </w:r>
+      <w:r>
+        <w:t xml:space="preserve"> если модель отвечает верно — не переписывать вопрос, а честно добавить строку в таблицу; для 1b это не страшно (парадигма измеряет поведение по умолчанию, и данные по Claude уже есть), для 1a — это и так приложение. </w:t>
+      </w:r>
+      <w:r>
+        <w:rPr>
+          <w:b/>
+        </w:rPr>
+        <w:t>2. (35 мин) Вычитка.</w:t>
+      </w:r>
+      <w:r>
+        <w:t xml:space="preserve"> </w:t>
+      </w:r>
+      <w:r>
+        <w:rPr>
+          <w:rFonts w:ascii="Courier New" w:hAnsi="Courier New"/>
+        </w:rPr>
+        <w:t>task2/critique1_haste.md</w:t>
+      </w:r>
+      <w:r>
+        <w:t xml:space="preserve"> (~890 слов) и </w:t>
+      </w:r>
+      <w:r>
+        <w:rPr>
+          <w:rFonts w:ascii="Courier New" w:hAnsi="Courier New"/>
+        </w:rPr>
+        <w:t>task2/critique2_bac.md</w:t>
+      </w:r>
+      <w:r>
+        <w:t xml:space="preserve"> (~1200 слов; при желании подрежьте абзац «What the error hides»); </w:t>
+      </w:r>
+      <w:r>
+        <w:rPr>
+          <w:rFonts w:ascii="Courier New" w:hAnsi="Courier New"/>
+        </w:rPr>
+        <w:t>task1b/paradigm.md</w:t>
+      </w:r>
+      <w:r>
+        <w:t xml:space="preserve"> (§1–§5); </w:t>
       </w:r>
       <w:r>
         <w:rPr>
@@ -245,302 +559,52 @@
         <w:t>experiments/critic_reviews.md</w:t>
       </w:r>
       <w:r>
-        <w:t xml:space="preserve">, версии до правок — </w:t>
+        <w:t xml:space="preserve"> — какие возражения уже сняты. </w:t>
+      </w:r>
+      <w:r>
+        <w:rPr>
+          <w:b/>
+        </w:rPr>
+        <w:t>3. (40 мин) Google Doc.</w:t>
+      </w:r>
+      <w:r>
+        <w:t xml:space="preserve"> Порядок разделов: Task 1b → Task 2, критика 1 → Task 2, критика 2 → разделитель «Supplementary material» → </w:t>
       </w:r>
       <w:r>
         <w:rPr>
           <w:rFonts w:ascii="Courier New" w:hAnsi="Courier New"/>
         </w:rPr>
-        <w:t>*_v1_before_review.md</w:t>
+        <w:t>task2/notes_supplementary.md</w:t>
       </w:r>
       <w:r>
-        <w:t xml:space="preserve">. Метод «отжига» сохранён в </w:t>
+        <w:t xml:space="preserve"> → (опц.) Task 1a. Задание требует supplementary </w:t>
+      </w:r>
+      <w:r>
+        <w:rPr>
+          <w:b/>
+        </w:rPr>
+        <w:t>в том же документе, явно отделённым</w:t>
+      </w:r>
+      <w:r>
+        <w:t xml:space="preserve">. Готовые .docx для импорта — </w:t>
       </w:r>
       <w:r>
         <w:rPr>
           <w:rFonts w:ascii="Courier New" w:hAnsi="Courier New"/>
         </w:rPr>
-        <w:t>docs/stuck_method.md</w:t>
+        <w:t>docs/deliverables_docx/</w:t>
       </w:r>
       <w:r>
-        <w:t xml:space="preserve"> и применён после первой (полностью «насыщенной») волны: карта неопределённости → смена поверхности атаки. </w:t>
+        <w:t xml:space="preserve">; после импорта проверьте таблицы и символы (≅, ≥). </w:t>
       </w:r>
       <w:r>
         <w:rPr>
           <w:b/>
         </w:rPr>
-        <w:t>GPT/Gemini протестировать было нельзя</w:t>
+        <w:t>4. (5 мин) Отправка.</w:t>
       </w:r>
       <w:r>
-        <w:t xml:space="preserve"> — утром обязательно прогоните D1–D3 из </w:t>
-      </w:r>
-      <w:r>
-        <w:rPr>
-          <w:rFonts w:ascii="Courier New" w:hAnsi="Courier New"/>
-        </w:rPr>
-        <w:t>task1a</w:t>
-      </w:r>
-      <w:r>
-        <w:t xml:space="preserve"> и примеры 1–2 из </w:t>
-      </w:r>
-      <w:r>
-        <w:rPr>
-          <w:rFonts w:ascii="Courier New" w:hAnsi="Courier New"/>
-        </w:rPr>
-        <w:t>task1b</w:t>
-      </w:r>
-      <w:r>
-        <w:t xml:space="preserve"> в бесплатных ChatGPT/Gemini (менторы просят именно это) и впишите результаты в таблицы «Evidence».</w:t>
-      </w:r>
-    </w:p>
-    <w:p>
-      <w:pPr>
-        <w:pStyle w:val="Heading2"/>
-      </w:pPr>
-      <w:r>
-        <w:t>3. Что получилось — по частям</w:t>
-      </w:r>
-    </w:p>
-    <w:p>
-      <w:pPr>
-        <w:pStyle w:val="Heading3"/>
-      </w:pPr>
-      <w:r>
-        <w:t>Task 2 (самая сильная часть; после вашей вычитки — подавать)</w:t>
-      </w:r>
-    </w:p>
-    <w:p>
-      <w:r/>
-      <w:r>
-        <w:rPr>
-          <w:b/>
-        </w:rPr>
-        <w:t>Аргумент 1 (спешка).</w:t>
-      </w:r>
-      <w:r>
-        <w:t xml:space="preserve"> Одна проблема: мысленный эксперимент сравнивает не «время сейчас» с «временем потом», а два </w:t>
-      </w:r>
-      <w:r>
-        <w:rPr>
-          <w:i/>
-        </w:rPr>
-        <w:t>вида деятельности</w:t>
-      </w:r>
-      <w:r>
-        <w:t xml:space="preserve"> — «завербовать эквивалент целой жизни за 2 года» и «прямую работу». Оговорка «не хуже тебя» делает всю работу и симметрична во времени: та же конструкция «доказывает», что годы 20–22 (или 40–42) ценнее всего, что после них — но лишь в смысле «целое ≥ части», а не «единица ресурса сейчас ценнее той же единицы потом». Плюс: оговорка — слабое неравенство («не меньше»), из которого нельзя получить «vastly». Единственное, что остаётся автору, — линейный эффект горизонта (~в 2 раза за 20 лет), который есть у любой долгосрочной инвестиции и на который текст не опирается. Три модели независимо на прямой вопрос дали тот же диагноз, что подтверждает, что критика не идиосинкразична (но и не гарантирует «неочевидность» — это для Task 2 не требуется).</w:t>
-      </w:r>
-    </w:p>
-    <w:p>
-      <w:r/>
-      <w:r>
-        <w:rPr>
-          <w:b/>
-        </w:rPr>
-        <w:t>Аргумент 2 (BAC).</w:t>
-      </w:r>
-      <w:r>
-        <w:t xml:space="preserve"> Одна проблема: центральное утверждение «BAC изоморфен многопользовательскому Stag Hunt (3p против 1)» ложно при собственных выплатах explainer'а. Цена BAC </w:t>
-      </w:r>
-      <w:r>
-        <w:rPr>
-          <w:i/>
-        </w:rPr>
-        <w:t>условна</w:t>
-      </w:r>
-      <w:r>
-        <w:t xml:space="preserve"> (платишь $1/N только BAC-детям), поэтому BAC = 3p + (1−p) = </w:t>
-      </w:r>
-      <w:r>
-        <w:rPr>
-          <w:b/>
-        </w:rPr>
-        <w:t>1 + 2p ≥ 1</w:t>
-      </w:r>
-      <w:r>
-        <w:t xml:space="preserve"> = Take: слабое доминирование, риска нет, порога 1/3 нет, разговоры о salience и риске неприменимы. Общее условие: BAC выгоден, когда 3·P(родитель BAC) &gt; доля награждённых детей; explainer ставит справа 1, слева p. Разобран и лучший ответ защитника: если все дети — листья (вакуумно «следуют BAC»), родитель платит полный $1 — но тогда BAC на этом уровне </w:t>
-      </w:r>
-      <w:r>
-        <w:rPr>
-          <w:i/>
-        </w:rPr>
-        <w:t>и есть</w:t>
-      </w:r>
-      <w:r>
-        <w:t xml:space="preserve"> отвергнутая наивная политика; порог 1/3 возвращается ровно там, где условность пуста. Вывод смягчён по совету критика: рушится не рациональность BAC, а объяснение «почему и когда» (порог, зависимость от salience, перенос из Stag Hunt).</w:t>
-      </w:r>
-    </w:p>
-    <w:p>
-      <w:pPr>
-        <w:pStyle w:val="Heading3"/>
-      </w:pPr>
-      <w:r>
-        <w:t>Task 1b (вторая по силе; главная находка ночи)</w:t>
-      </w:r>
-    </w:p>
-    <w:p>
-      <w:r>
-        <w:t xml:space="preserve">Парадигма </w:t>
-      </w:r>
-      <w:r>
-        <w:rPr>
-          <w:b/>
-        </w:rPr>
-        <w:t>«Embedded False Frames» (встроенные ложные рамки)</w:t>
-      </w:r>
-      <w:r>
-        <w:t xml:space="preserve">. Берём правдоподобную, </w:t>
-      </w:r>
-      <w:r>
-        <w:rPr>
-          <w:i/>
-        </w:rPr>
-        <w:t>нехрестоматийную</w:t>
-      </w:r>
-      <w:r>
-        <w:t xml:space="preserve"> ложную редукцию задачи к известной модели (как BAC→Stag Hunt). При прямом вопросе «есть ли проблема?» модели её находят. Но если ту же редукцию </w:t>
-      </w:r>
-      <w:r>
-        <w:rPr>
-          <w:i/>
-        </w:rPr>
-        <w:t>утвердить в условии</w:t>
-      </w:r>
-      <w:r>
-        <w:t xml:space="preserve"> и попросить </w:t>
-      </w:r>
-      <w:r>
-        <w:rPr>
-          <w:i/>
-        </w:rPr>
-        <w:t>посчитать</w:t>
-      </w:r>
-      <w:r>
-        <w:t xml:space="preserve"> то, что имеет смысл только при её истинности (долю, ставку дисконтирования), с общей лазейкой «ответьте FALSE PREMISE», — модели считают внутри ложной рамки. Ключевые данные (с лазейкой): «сеть поставщиков ≅ Stag Hunt» — </w:t>
-      </w:r>
-      <w:r>
-        <w:rPr>
-          <w:b/>
-        </w:rPr>
-        <w:t>Sonnet 0/4, Opus 1/4, Fable 3/4 верных</w:t>
-      </w:r>
-      <w:r>
-        <w:t xml:space="preserve">; без лазейки все три ошиблись; «спешка ⇒ ставка дисконтирования r≈0.35» — все три посчитали в 6 из 6 прогонов (в двух формулировках), хотя напрямую все отвергли аргумент. </w:t>
-      </w:r>
-      <w:r>
-        <w:rPr>
-          <w:b/>
-        </w:rPr>
-        <w:t>Абляции</w:t>
-      </w:r>
-      <w:r>
-        <w:t xml:space="preserve"> (по требованию критика): явная инструкция «проверь посылки», симметричная обёртка «в анализе может быть ошибка», лазейка, называющая альтернативный вывод, или </w:t>
-      </w:r>
-      <w:r>
-        <w:rPr>
-          <w:i/>
-        </w:rPr>
-        <w:t>оценочный</w:t>
-      </w:r>
-      <w:r>
-        <w:t xml:space="preserve"> формат A/B/C — включают проверку у Opus/Fable, но не у Sonnet; валидный двойник (настоящий Stag Hunt с фиксированным взносом) все считают верно. На хрестоматийных ошибках (counterfactual mugging, public goods, FairBot, RLHF≅debate) рамку отвергают все. </w:t>
-      </w:r>
-      <w:r>
-        <w:rPr>
-          <w:b/>
-        </w:rPr>
-        <w:t>Тезис</w:t>
-      </w:r>
-      <w:r>
-        <w:t xml:space="preserve">: модели </w:t>
-      </w:r>
-      <w:r>
-        <w:rPr>
-          <w:i/>
-        </w:rPr>
-        <w:t>владеют</w:t>
-      </w:r>
-      <w:r>
-        <w:t xml:space="preserve"> нужным выводом, но по умолчанию не запускают его, если рамка утверждена и нужен только расчёт; парадигма измеряет </w:t>
-      </w:r>
-      <w:r>
-        <w:rPr>
-          <w:i/>
-        </w:rPr>
-        <w:t>непрошеную</w:t>
-      </w:r>
-      <w:r>
-        <w:t xml:space="preserve"> проверку — то, что нужно от модели-соавтора, а не от модели-грейдера, — и даёт новый тип constraint'а (инвариантность вердикта к способу подачи), пригодный как обучающий сигнал без экспертной разметки. Честно указано: связь с литературой о ложных посылках и sycophancy, малые n, только Claude, чувствительность к формулировке (она и есть результат).</w:t>
-      </w:r>
-    </w:p>
-    <w:p>
-      <w:pPr>
-        <w:pStyle w:val="Heading3"/>
-      </w:pPr>
-      <w:r>
-        <w:t>Task 1a (слабее; всё честно написано в документе)</w:t>
-      </w:r>
-    </w:p>
-    <w:p>
-      <w:r>
-        <w:t>DTBench-стиль насыщен: 27/27 ячеек первой волны и вся вторая волна решены. Под честной формулировкой ни один пункт не роняет Fable; D1 (CDT при 50% «я — симуляция», верно one-box) проваливает Haiku, а Sonnet — только со «слоганом» в дистракторе (нейтральная версия — 3/3 верно); D2 (встроенная рамка, см. выше) проваливают Sonnet и Opus, Fable — без лазейки; D3 (эффект отбора «родитель — случайный агент») проваливает Sonnet. Контроль «анропический Fauxcomb» (симуляция каузально инертна) все решают верно. Документ прямо ссылается на пункт о снисхождении к бесплатным моделям.</w:t>
-      </w:r>
-    </w:p>
-    <w:p>
-      <w:pPr>
-        <w:pStyle w:val="Heading2"/>
-      </w:pPr>
-      <w:r>
-        <w:t>4. Что сделать утром (2 часа)</w:t>
-      </w:r>
-    </w:p>
-    <w:p>
-      <w:pPr>
-        <w:pStyle w:val="ListNumber"/>
-      </w:pPr>
-      <w:r>
-        <w:t>Прогнать D1, D2, D3 и пример 2 (assertion-форма) в бесплатных ChatGPT/Gemini; вписать в таблицы.</w:t>
-      </w:r>
-    </w:p>
-    <w:p>
-      <w:pPr>
-        <w:pStyle w:val="ListNumber"/>
-      </w:pPr>
-      <w:r>
-        <w:t xml:space="preserve">Прочитать обе критики (≈1000–1200 слов каждая) и </w:t>
-      </w:r>
-      <w:r>
-        <w:rPr>
-          <w:rFonts w:ascii="Courier New" w:hAnsi="Courier New"/>
-        </w:rPr>
-        <w:t>experiments/critic_reviews.md</w:t>
-      </w:r>
-      <w:r>
-        <w:t>; при желании подрезать BAC-критику до 1.5 стр.</w:t>
-      </w:r>
-    </w:p>
-    <w:p>
-      <w:pPr>
-        <w:pStyle w:val="ListNumber"/>
-      </w:pPr>
-      <w:r>
-        <w:t xml:space="preserve">Выбор для Task 1: подавать </w:t>
-      </w:r>
-      <w:r>
-        <w:rPr>
-          <w:b/>
-        </w:rPr>
-        <w:t>1b</w:t>
-      </w:r>
-      <w:r>
-        <w:t xml:space="preserve"> как основное, 1a — как приложение (правила допускают одно из двух).</w:t>
-      </w:r>
-    </w:p>
-    <w:p>
-      <w:pPr>
-        <w:pStyle w:val="ListNumber"/>
-      </w:pPr>
-      <w:r>
-        <w:t>Перенести в Google Doc: Task 1b, Task 2 (две критики + supplementary), при желании Task 1a.</w:t>
+        <w:t xml:space="preserve"> Доступ по ссылке; адрес/форма — из письма MATS (в задании их нет).</w:t>
       </w:r>
     </w:p>
     <w:p>
@@ -553,7 +617,7 @@
     </w:p>
     <w:p>
       <w:r>
-        <w:t>Только линейка Claude, 1–4 прогона на ячейку, разметка моя (без слепого грейдинга). Ссылки в research/README.md из среды не открывались — проверьте перед цитированием. Все ключевые числа перепроверены вручную и независимыми агентами.</w:t>
+        <w:t>Только линейка Claude, 1–4 прогона на ячейку, грейдинг мой (не слепой). Все ключевые числа перепроверены вручную и независимыми агентами; пример D2/Example 1 переиспользует ошибку из BAC (это раскрыто в обоих файлах).</w:t>
       </w:r>
     </w:p>
     <w:sectPr>

</xml_diff>